<commit_message>
After you merge (the to-do list is also in the PR):
</commit_message>
<xml_diff>
--- a/content/Lectures/Semester 1/Week 08 - Networks - Shortest Paths and MST/5 Source Files/Week 8 - Tutorial - Networks - Shortest Paths and MST.docx
+++ b/content/Lectures/Semester 1/Week 08 - Networks - Shortest Paths and MST/5 Source Files/Week 8 - Tutorial - Networks - Shortest Paths and MST.docx
@@ -1,6 +1,6 @@
 
 <file path=word/document.xml><?xml version="1.0" encoding="utf-8"?>
-<w:document xmlns:wpc="http://schemas.microsoft.com/office/word/2010/wordprocessingCanvas" xmlns:cx="http://schemas.microsoft.com/office/drawing/2014/chartex" xmlns:cx1="http://schemas.microsoft.com/office/drawing/2015/9/8/chartex" xmlns:cx2="http://schemas.microsoft.com/office/drawing/2015/10/21/chartex" xmlns:cx3="http://schemas.microsoft.com/office/drawing/2016/5/9/chartex" xmlns:cx4="http://schemas.microsoft.com/office/drawing/2016/5/10/chartex" xmlns:cx5="http://schemas.microsoft.com/office/drawing/2016/5/11/chartex" xmlns:cx6="http://schemas.microsoft.com/office/drawing/2016/5/12/chartex" xmlns:cx7="http://schemas.microsoft.com/office/drawing/2016/5/13/chartex" xmlns:cx8="http://schemas.microsoft.com/office/drawing/2016/5/14/chartex" xmlns:mc="http://schemas.openxmlformats.org/markup-compatibility/2006" xmlns:aink="http://schemas.microsoft.com/office/drawing/2016/ink" xmlns:am3d="http://schemas.microsoft.com/office/drawing/2017/model3d" xmlns:o="urn:schemas-microsoft-com:office:office" xmlns:oel="http://schemas.microsoft.com/office/2019/extlst" xmlns:r="http://schemas.openxmlformats.org/officeDocument/2006/relationships" xmlns:m="http://schemas.openxmlformats.org/officeDocument/2006/math" xmlns:v="urn:schemas-microsoft-com:vml" xmlns:wp14="http://schemas.microsoft.com/office/word/2010/wordprocessingDrawing" xmlns:wp="http://schemas.openxmlformats.org/drawingml/2006/wordprocessingDrawing" xmlns:w10="urn:schemas-microsoft-com:office:word" xmlns:w="http://schemas.openxmlformats.org/wordprocessingml/2006/main" xmlns:w14="http://schemas.microsoft.com/office/word/2010/wordml" xmlns:w15="http://schemas.microsoft.com/office/word/2012/wordml" xmlns:w16cex="http://schemas.microsoft.com/office/word/2018/wordml/cex" xmlns:w16cid="http://schemas.microsoft.com/office/word/2016/wordml/cid" xmlns:w16="http://schemas.microsoft.com/office/word/2018/wordml" xmlns:w16du="http://schemas.microsoft.com/office/word/2023/wordml/word16du" xmlns:w16sdtdh="http://schemas.microsoft.com/office/word/2020/wordml/sdtdatahash" xmlns:w16sdtfl="http://schemas.microsoft.com/office/word/2024/wordml/sdtformatlock" xmlns:w16se="http://schemas.microsoft.com/office/word/2015/wordml/symex" xmlns:wpg="http://schemas.microsoft.com/office/word/2010/wordprocessingGroup" xmlns:wpi="http://schemas.microsoft.com/office/word/2010/wordprocessingInk" xmlns:wne="http://schemas.microsoft.com/office/word/2006/wordml" xmlns:wps="http://schemas.microsoft.com/office/word/2010/wordprocessingShape" mc:Ignorable="w14 w15 w16se w16cid w16 w16cex w16sdtdh w16sdtfl w16du wp14">
+<w:document xmlns:wpc="http://schemas.microsoft.com/office/word/2010/wordprocessingCanvas" xmlns:cx="http://schemas.microsoft.com/office/drawing/2014/chartex" xmlns:cx1="http://schemas.microsoft.com/office/drawing/2015/9/8/chartex" xmlns:cx2="http://schemas.microsoft.com/office/drawing/2015/10/21/chartex" xmlns:cx3="http://schemas.microsoft.com/office/drawing/2016/5/9/chartex" xmlns:cx4="http://schemas.microsoft.com/office/drawing/2016/5/10/chartex" xmlns:cx5="http://schemas.microsoft.com/office/drawing/2016/5/11/chartex" xmlns:cx6="http://schemas.microsoft.com/office/drawing/2016/5/12/chartex" xmlns:cx7="http://schemas.microsoft.com/office/drawing/2016/5/13/chartex" xmlns:cx8="http://schemas.microsoft.com/office/drawing/2016/5/14/chartex" xmlns:mc="http://schemas.openxmlformats.org/markup-compatibility/2006" xmlns:aink="http://schemas.microsoft.com/office/drawing/2016/ink" xmlns:am3d="http://schemas.microsoft.com/office/drawing/2017/model3d" xmlns:o="urn:schemas-microsoft-com:office:office" xmlns:oel="http://schemas.microsoft.com/office/2019/extlst" xmlns:r="http://schemas.openxmlformats.org/officeDocument/2006/relationships" xmlns:m="http://schemas.openxmlformats.org/officeDocument/2006/math" xmlns:v="urn:schemas-microsoft-com:vml" xmlns:wp14="http://schemas.microsoft.com/office/word/2010/wordprocessingDrawing" xmlns:wp="http://schemas.openxmlformats.org/drawingml/2006/wordprocessingDrawing" xmlns:w10="urn:schemas-microsoft-com:office:word" xmlns:w="http://schemas.openxmlformats.org/wordprocessingml/2006/main" xmlns:w14="http://schemas.microsoft.com/office/word/2010/wordml" xmlns:w15="http://schemas.microsoft.com/office/word/2012/wordml" xmlns:w16cex="http://schemas.microsoft.com/office/word/2018/wordml/cex" xmlns:w16cid="http://schemas.microsoft.com/office/word/2016/wordml/cid" xmlns:w16="http://schemas.microsoft.com/office/word/2018/wordml" xmlns:w16sdtdh="http://schemas.microsoft.com/office/word/2020/wordml/sdtdatahash" xmlns:w16se="http://schemas.microsoft.com/office/word/2015/wordml/symex" xmlns:wpg="http://schemas.microsoft.com/office/word/2010/wordprocessingGroup" xmlns:wpi="http://schemas.microsoft.com/office/word/2010/wordprocessingInk" xmlns:wne="http://schemas.microsoft.com/office/word/2006/wordml" xmlns:wps="http://schemas.microsoft.com/office/word/2010/wordprocessingShape" mc:Ignorable="w14 w15 w16se w16cid w16 w16cex w16sdtdh wp14">
   <w:body>
     <w:p>
       <w:pPr>
@@ -254,10 +254,10 @@
           <w:noProof/>
         </w:rPr>
         <w:drawing>
-          <wp:inline distT="0" distB="0" distL="0" distR="0" wp14:anchorId="67EF29D7" wp14:editId="1B5E7AD2">
-            <wp:extent cx="3057099" cy="1721918"/>
-            <wp:effectExtent l="0" t="0" r="0" b="0"/>
-            <wp:docPr id="6" name="Picture 6"/>
+          <wp:inline distT="0" distB="0" distL="0" distR="0" wp14:anchorId="27A91EC3" wp14:editId="17AB7082">
+            <wp:extent cx="4303079" cy="2424953"/>
+            <wp:effectExtent l="0" t="0" r="2540" b="0"/>
+            <wp:docPr id="9" name="Picture 9"/>
             <wp:cNvGraphicFramePr>
               <a:graphicFrameLocks xmlns:a="http://schemas.openxmlformats.org/drawingml/2006/main" noChangeAspect="1"/>
             </wp:cNvGraphicFramePr>
@@ -277,7 +277,7 @@
                   <pic:spPr>
                     <a:xfrm>
                       <a:off x="0" y="0"/>
-                      <a:ext cx="3098954" cy="1745493"/>
+                      <a:ext cx="4313833" cy="2431013"/>
                     </a:xfrm>
                     <a:prstGeom prst="rect">
                       <a:avLst/>
@@ -315,15 +315,7 @@
         </w:numPr>
       </w:pPr>
       <w:r>
-        <w:t xml:space="preserve">Initialise the network, source vertex has </w:t>
-      </w:r>
-      <w:proofErr w:type="gramStart"/>
-      <w:r>
-        <w:t>a distance of 0</w:t>
-      </w:r>
-      <w:proofErr w:type="gramEnd"/>
-      <w:r>
-        <w:t xml:space="preserve"> and all other vertices a distance of </w:t>
+        <w:t xml:space="preserve">Initialise the network, source vertex has a distance of 0 and all other vertices a distance of </w:t>
       </w:r>
       <m:oMath>
         <m:r>
@@ -418,6 +410,7 @@
         <w:rPr>
           <w:noProof/>
         </w:rPr>
+        <w:lastRenderedPageBreak/>
         <w:drawing>
           <wp:inline distT="0" distB="0" distL="0" distR="0" wp14:anchorId="7F6D500F" wp14:editId="3985A102">
             <wp:extent cx="3487045" cy="1751851"/>
@@ -748,7 +741,7 @@
 </file>
 
 <file path=word/endnotes.xml><?xml version="1.0" encoding="utf-8"?>
-<w:endnotes xmlns:wpc="http://schemas.microsoft.com/office/word/2010/wordprocessingCanvas" xmlns:cx="http://schemas.microsoft.com/office/drawing/2014/chartex" xmlns:cx1="http://schemas.microsoft.com/office/drawing/2015/9/8/chartex" xmlns:cx2="http://schemas.microsoft.com/office/drawing/2015/10/21/chartex" xmlns:cx3="http://schemas.microsoft.com/office/drawing/2016/5/9/chartex" xmlns:cx4="http://schemas.microsoft.com/office/drawing/2016/5/10/chartex" xmlns:cx5="http://schemas.microsoft.com/office/drawing/2016/5/11/chartex" xmlns:cx6="http://schemas.microsoft.com/office/drawing/2016/5/12/chartex" xmlns:cx7="http://schemas.microsoft.com/office/drawing/2016/5/13/chartex" xmlns:cx8="http://schemas.microsoft.com/office/drawing/2016/5/14/chartex" xmlns:mc="http://schemas.openxmlformats.org/markup-compatibility/2006" xmlns:aink="http://schemas.microsoft.com/office/drawing/2016/ink" xmlns:am3d="http://schemas.microsoft.com/office/drawing/2017/model3d" xmlns:o="urn:schemas-microsoft-com:office:office" xmlns:oel="http://schemas.microsoft.com/office/2019/extlst" xmlns:r="http://schemas.openxmlformats.org/officeDocument/2006/relationships" xmlns:m="http://schemas.openxmlformats.org/officeDocument/2006/math" xmlns:v="urn:schemas-microsoft-com:vml" xmlns:wp14="http://schemas.microsoft.com/office/word/2010/wordprocessingDrawing" xmlns:wp="http://schemas.openxmlformats.org/drawingml/2006/wordprocessingDrawing" xmlns:w10="urn:schemas-microsoft-com:office:word" xmlns:w="http://schemas.openxmlformats.org/wordprocessingml/2006/main" xmlns:w14="http://schemas.microsoft.com/office/word/2010/wordml" xmlns:w15="http://schemas.microsoft.com/office/word/2012/wordml" xmlns:w16cex="http://schemas.microsoft.com/office/word/2018/wordml/cex" xmlns:w16cid="http://schemas.microsoft.com/office/word/2016/wordml/cid" xmlns:w16="http://schemas.microsoft.com/office/word/2018/wordml" xmlns:w16du="http://schemas.microsoft.com/office/word/2023/wordml/word16du" xmlns:w16sdtdh="http://schemas.microsoft.com/office/word/2020/wordml/sdtdatahash" xmlns:w16sdtfl="http://schemas.microsoft.com/office/word/2024/wordml/sdtformatlock" xmlns:w16se="http://schemas.microsoft.com/office/word/2015/wordml/symex" xmlns:wpg="http://schemas.microsoft.com/office/word/2010/wordprocessingGroup" xmlns:wpi="http://schemas.microsoft.com/office/word/2010/wordprocessingInk" xmlns:wne="http://schemas.microsoft.com/office/word/2006/wordml" xmlns:wps="http://schemas.microsoft.com/office/word/2010/wordprocessingShape" mc:Ignorable="w14 w15 w16se w16cid w16 w16cex w16sdtdh w16sdtfl w16du wp14">
+<w:endnotes xmlns:wpc="http://schemas.microsoft.com/office/word/2010/wordprocessingCanvas" xmlns:cx="http://schemas.microsoft.com/office/drawing/2014/chartex" xmlns:cx1="http://schemas.microsoft.com/office/drawing/2015/9/8/chartex" xmlns:cx2="http://schemas.microsoft.com/office/drawing/2015/10/21/chartex" xmlns:cx3="http://schemas.microsoft.com/office/drawing/2016/5/9/chartex" xmlns:cx4="http://schemas.microsoft.com/office/drawing/2016/5/10/chartex" xmlns:cx5="http://schemas.microsoft.com/office/drawing/2016/5/11/chartex" xmlns:cx6="http://schemas.microsoft.com/office/drawing/2016/5/12/chartex" xmlns:cx7="http://schemas.microsoft.com/office/drawing/2016/5/13/chartex" xmlns:cx8="http://schemas.microsoft.com/office/drawing/2016/5/14/chartex" xmlns:mc="http://schemas.openxmlformats.org/markup-compatibility/2006" xmlns:aink="http://schemas.microsoft.com/office/drawing/2016/ink" xmlns:am3d="http://schemas.microsoft.com/office/drawing/2017/model3d" xmlns:o="urn:schemas-microsoft-com:office:office" xmlns:oel="http://schemas.microsoft.com/office/2019/extlst" xmlns:r="http://schemas.openxmlformats.org/officeDocument/2006/relationships" xmlns:m="http://schemas.openxmlformats.org/officeDocument/2006/math" xmlns:v="urn:schemas-microsoft-com:vml" xmlns:wp14="http://schemas.microsoft.com/office/word/2010/wordprocessingDrawing" xmlns:wp="http://schemas.openxmlformats.org/drawingml/2006/wordprocessingDrawing" xmlns:w10="urn:schemas-microsoft-com:office:word" xmlns:w="http://schemas.openxmlformats.org/wordprocessingml/2006/main" xmlns:w14="http://schemas.microsoft.com/office/word/2010/wordml" xmlns:w15="http://schemas.microsoft.com/office/word/2012/wordml" xmlns:w16cex="http://schemas.microsoft.com/office/word/2018/wordml/cex" xmlns:w16cid="http://schemas.microsoft.com/office/word/2016/wordml/cid" xmlns:w16="http://schemas.microsoft.com/office/word/2018/wordml" xmlns:w16sdtdh="http://schemas.microsoft.com/office/word/2020/wordml/sdtdatahash" xmlns:w16se="http://schemas.microsoft.com/office/word/2015/wordml/symex" xmlns:wpg="http://schemas.microsoft.com/office/word/2010/wordprocessingGroup" xmlns:wpi="http://schemas.microsoft.com/office/word/2010/wordprocessingInk" xmlns:wne="http://schemas.microsoft.com/office/word/2006/wordml" xmlns:wps="http://schemas.microsoft.com/office/word/2010/wordprocessingShape" mc:Ignorable="w14 w15 w16se w16cid w16 w16cex w16sdtdh wp14">
   <w:endnote w:type="separator" w:id="-1">
     <w:p>
       <w:pPr>
@@ -780,7 +773,7 @@
 </file>
 
 <file path=word/footer1.xml><?xml version="1.0" encoding="utf-8"?>
-<w:ftr xmlns:wpc="http://schemas.microsoft.com/office/word/2010/wordprocessingCanvas" xmlns:cx="http://schemas.microsoft.com/office/drawing/2014/chartex" xmlns:cx1="http://schemas.microsoft.com/office/drawing/2015/9/8/chartex" xmlns:cx2="http://schemas.microsoft.com/office/drawing/2015/10/21/chartex" xmlns:cx3="http://schemas.microsoft.com/office/drawing/2016/5/9/chartex" xmlns:cx4="http://schemas.microsoft.com/office/drawing/2016/5/10/chartex" xmlns:cx5="http://schemas.microsoft.com/office/drawing/2016/5/11/chartex" xmlns:cx6="http://schemas.microsoft.com/office/drawing/2016/5/12/chartex" xmlns:cx7="http://schemas.microsoft.com/office/drawing/2016/5/13/chartex" xmlns:cx8="http://schemas.microsoft.com/office/drawing/2016/5/14/chartex" xmlns:mc="http://schemas.openxmlformats.org/markup-compatibility/2006" xmlns:aink="http://schemas.microsoft.com/office/drawing/2016/ink" xmlns:am3d="http://schemas.microsoft.com/office/drawing/2017/model3d" xmlns:o="urn:schemas-microsoft-com:office:office" xmlns:oel="http://schemas.microsoft.com/office/2019/extlst" xmlns:r="http://schemas.openxmlformats.org/officeDocument/2006/relationships" xmlns:m="http://schemas.openxmlformats.org/officeDocument/2006/math" xmlns:v="urn:schemas-microsoft-com:vml" xmlns:wp14="http://schemas.microsoft.com/office/word/2010/wordprocessingDrawing" xmlns:wp="http://schemas.openxmlformats.org/drawingml/2006/wordprocessingDrawing" xmlns:w10="urn:schemas-microsoft-com:office:word" xmlns:w="http://schemas.openxmlformats.org/wordprocessingml/2006/main" xmlns:w14="http://schemas.microsoft.com/office/word/2010/wordml" xmlns:w15="http://schemas.microsoft.com/office/word/2012/wordml" xmlns:w16cex="http://schemas.microsoft.com/office/word/2018/wordml/cex" xmlns:w16cid="http://schemas.microsoft.com/office/word/2016/wordml/cid" xmlns:w16="http://schemas.microsoft.com/office/word/2018/wordml" xmlns:w16du="http://schemas.microsoft.com/office/word/2023/wordml/word16du" xmlns:w16sdtdh="http://schemas.microsoft.com/office/word/2020/wordml/sdtdatahash" xmlns:w16sdtfl="http://schemas.microsoft.com/office/word/2024/wordml/sdtformatlock" xmlns:w16se="http://schemas.microsoft.com/office/word/2015/wordml/symex" xmlns:wpg="http://schemas.microsoft.com/office/word/2010/wordprocessingGroup" xmlns:wpi="http://schemas.microsoft.com/office/word/2010/wordprocessingInk" xmlns:wne="http://schemas.microsoft.com/office/word/2006/wordml" xmlns:wps="http://schemas.microsoft.com/office/word/2010/wordprocessingShape" mc:Ignorable="w14 w15 w16se w16cid w16 w16cex w16sdtdh w16sdtfl w16du wp14">
+<w:ftr xmlns:wpc="http://schemas.microsoft.com/office/word/2010/wordprocessingCanvas" xmlns:cx="http://schemas.microsoft.com/office/drawing/2014/chartex" xmlns:cx1="http://schemas.microsoft.com/office/drawing/2015/9/8/chartex" xmlns:cx2="http://schemas.microsoft.com/office/drawing/2015/10/21/chartex" xmlns:cx3="http://schemas.microsoft.com/office/drawing/2016/5/9/chartex" xmlns:cx4="http://schemas.microsoft.com/office/drawing/2016/5/10/chartex" xmlns:cx5="http://schemas.microsoft.com/office/drawing/2016/5/11/chartex" xmlns:cx6="http://schemas.microsoft.com/office/drawing/2016/5/12/chartex" xmlns:cx7="http://schemas.microsoft.com/office/drawing/2016/5/13/chartex" xmlns:cx8="http://schemas.microsoft.com/office/drawing/2016/5/14/chartex" xmlns:mc="http://schemas.openxmlformats.org/markup-compatibility/2006" xmlns:aink="http://schemas.microsoft.com/office/drawing/2016/ink" xmlns:am3d="http://schemas.microsoft.com/office/drawing/2017/model3d" xmlns:o="urn:schemas-microsoft-com:office:office" xmlns:oel="http://schemas.microsoft.com/office/2019/extlst" xmlns:r="http://schemas.openxmlformats.org/officeDocument/2006/relationships" xmlns:m="http://schemas.openxmlformats.org/officeDocument/2006/math" xmlns:v="urn:schemas-microsoft-com:vml" xmlns:wp14="http://schemas.microsoft.com/office/word/2010/wordprocessingDrawing" xmlns:wp="http://schemas.openxmlformats.org/drawingml/2006/wordprocessingDrawing" xmlns:w10="urn:schemas-microsoft-com:office:word" xmlns:w="http://schemas.openxmlformats.org/wordprocessingml/2006/main" xmlns:w14="http://schemas.microsoft.com/office/word/2010/wordml" xmlns:w15="http://schemas.microsoft.com/office/word/2012/wordml" xmlns:w16cex="http://schemas.microsoft.com/office/word/2018/wordml/cex" xmlns:w16cid="http://schemas.microsoft.com/office/word/2016/wordml/cid" xmlns:w16="http://schemas.microsoft.com/office/word/2018/wordml" xmlns:w16sdtdh="http://schemas.microsoft.com/office/word/2020/wordml/sdtdatahash" xmlns:w16se="http://schemas.microsoft.com/office/word/2015/wordml/symex" xmlns:wpg="http://schemas.microsoft.com/office/word/2010/wordprocessingGroup" xmlns:wpi="http://schemas.microsoft.com/office/word/2010/wordprocessingInk" xmlns:wne="http://schemas.microsoft.com/office/word/2006/wordml" xmlns:wps="http://schemas.microsoft.com/office/word/2010/wordprocessingShape" mc:Ignorable="w14 w15 w16se w16cid w16 w16cex w16sdtdh wp14">
   <w:p>
     <w:pPr>
       <w:pStyle w:val="Footer"/>
@@ -790,7 +783,7 @@
 </file>
 
 <file path=word/footer2.xml><?xml version="1.0" encoding="utf-8"?>
-<w:ftr xmlns:wpc="http://schemas.microsoft.com/office/word/2010/wordprocessingCanvas" xmlns:cx="http://schemas.microsoft.com/office/drawing/2014/chartex" xmlns:cx1="http://schemas.microsoft.com/office/drawing/2015/9/8/chartex" xmlns:cx2="http://schemas.microsoft.com/office/drawing/2015/10/21/chartex" xmlns:cx3="http://schemas.microsoft.com/office/drawing/2016/5/9/chartex" xmlns:cx4="http://schemas.microsoft.com/office/drawing/2016/5/10/chartex" xmlns:cx5="http://schemas.microsoft.com/office/drawing/2016/5/11/chartex" xmlns:cx6="http://schemas.microsoft.com/office/drawing/2016/5/12/chartex" xmlns:cx7="http://schemas.microsoft.com/office/drawing/2016/5/13/chartex" xmlns:cx8="http://schemas.microsoft.com/office/drawing/2016/5/14/chartex" xmlns:mc="http://schemas.openxmlformats.org/markup-compatibility/2006" xmlns:aink="http://schemas.microsoft.com/office/drawing/2016/ink" xmlns:am3d="http://schemas.microsoft.com/office/drawing/2017/model3d" xmlns:o="urn:schemas-microsoft-com:office:office" xmlns:oel="http://schemas.microsoft.com/office/2019/extlst" xmlns:r="http://schemas.openxmlformats.org/officeDocument/2006/relationships" xmlns:m="http://schemas.openxmlformats.org/officeDocument/2006/math" xmlns:v="urn:schemas-microsoft-com:vml" xmlns:wp14="http://schemas.microsoft.com/office/word/2010/wordprocessingDrawing" xmlns:wp="http://schemas.openxmlformats.org/drawingml/2006/wordprocessingDrawing" xmlns:w10="urn:schemas-microsoft-com:office:word" xmlns:w="http://schemas.openxmlformats.org/wordprocessingml/2006/main" xmlns:w14="http://schemas.microsoft.com/office/word/2010/wordml" xmlns:w15="http://schemas.microsoft.com/office/word/2012/wordml" xmlns:w16cex="http://schemas.microsoft.com/office/word/2018/wordml/cex" xmlns:w16cid="http://schemas.microsoft.com/office/word/2016/wordml/cid" xmlns:w16="http://schemas.microsoft.com/office/word/2018/wordml" xmlns:w16du="http://schemas.microsoft.com/office/word/2023/wordml/word16du" xmlns:w16sdtdh="http://schemas.microsoft.com/office/word/2020/wordml/sdtdatahash" xmlns:w16sdtfl="http://schemas.microsoft.com/office/word/2024/wordml/sdtformatlock" xmlns:w16se="http://schemas.microsoft.com/office/word/2015/wordml/symex" xmlns:wpg="http://schemas.microsoft.com/office/word/2010/wordprocessingGroup" xmlns:wpi="http://schemas.microsoft.com/office/word/2010/wordprocessingInk" xmlns:wne="http://schemas.microsoft.com/office/word/2006/wordml" xmlns:wps="http://schemas.microsoft.com/office/word/2010/wordprocessingShape" mc:Ignorable="w14 w15 w16se w16cid w16 w16cex w16sdtdh w16sdtfl w16du wp14">
+<w:ftr xmlns:wpc="http://schemas.microsoft.com/office/word/2010/wordprocessingCanvas" xmlns:cx="http://schemas.microsoft.com/office/drawing/2014/chartex" xmlns:cx1="http://schemas.microsoft.com/office/drawing/2015/9/8/chartex" xmlns:cx2="http://schemas.microsoft.com/office/drawing/2015/10/21/chartex" xmlns:cx3="http://schemas.microsoft.com/office/drawing/2016/5/9/chartex" xmlns:cx4="http://schemas.microsoft.com/office/drawing/2016/5/10/chartex" xmlns:cx5="http://schemas.microsoft.com/office/drawing/2016/5/11/chartex" xmlns:cx6="http://schemas.microsoft.com/office/drawing/2016/5/12/chartex" xmlns:cx7="http://schemas.microsoft.com/office/drawing/2016/5/13/chartex" xmlns:cx8="http://schemas.microsoft.com/office/drawing/2016/5/14/chartex" xmlns:mc="http://schemas.openxmlformats.org/markup-compatibility/2006" xmlns:aink="http://schemas.microsoft.com/office/drawing/2016/ink" xmlns:am3d="http://schemas.microsoft.com/office/drawing/2017/model3d" xmlns:o="urn:schemas-microsoft-com:office:office" xmlns:oel="http://schemas.microsoft.com/office/2019/extlst" xmlns:r="http://schemas.openxmlformats.org/officeDocument/2006/relationships" xmlns:m="http://schemas.openxmlformats.org/officeDocument/2006/math" xmlns:v="urn:schemas-microsoft-com:vml" xmlns:wp14="http://schemas.microsoft.com/office/word/2010/wordprocessingDrawing" xmlns:wp="http://schemas.openxmlformats.org/drawingml/2006/wordprocessingDrawing" xmlns:w10="urn:schemas-microsoft-com:office:word" xmlns:w="http://schemas.openxmlformats.org/wordprocessingml/2006/main" xmlns:w14="http://schemas.microsoft.com/office/word/2010/wordml" xmlns:w15="http://schemas.microsoft.com/office/word/2012/wordml" xmlns:w16cex="http://schemas.microsoft.com/office/word/2018/wordml/cex" xmlns:w16cid="http://schemas.microsoft.com/office/word/2016/wordml/cid" xmlns:w16="http://schemas.microsoft.com/office/word/2018/wordml" xmlns:w16sdtdh="http://schemas.microsoft.com/office/word/2020/wordml/sdtdatahash" xmlns:w16se="http://schemas.microsoft.com/office/word/2015/wordml/symex" xmlns:wpg="http://schemas.microsoft.com/office/word/2010/wordprocessingGroup" xmlns:wpi="http://schemas.microsoft.com/office/word/2010/wordprocessingInk" xmlns:wne="http://schemas.microsoft.com/office/word/2006/wordml" xmlns:wps="http://schemas.microsoft.com/office/word/2010/wordprocessingShape" mc:Ignorable="w14 w15 w16se w16cid w16 w16cex w16sdtdh wp14">
   <w:p>
     <w:pPr>
       <w:pStyle w:val="Footer"/>
@@ -915,7 +908,7 @@
 </file>
 
 <file path=word/footer3.xml><?xml version="1.0" encoding="utf-8"?>
-<w:ftr xmlns:wpc="http://schemas.microsoft.com/office/word/2010/wordprocessingCanvas" xmlns:cx="http://schemas.microsoft.com/office/drawing/2014/chartex" xmlns:cx1="http://schemas.microsoft.com/office/drawing/2015/9/8/chartex" xmlns:cx2="http://schemas.microsoft.com/office/drawing/2015/10/21/chartex" xmlns:cx3="http://schemas.microsoft.com/office/drawing/2016/5/9/chartex" xmlns:cx4="http://schemas.microsoft.com/office/drawing/2016/5/10/chartex" xmlns:cx5="http://schemas.microsoft.com/office/drawing/2016/5/11/chartex" xmlns:cx6="http://schemas.microsoft.com/office/drawing/2016/5/12/chartex" xmlns:cx7="http://schemas.microsoft.com/office/drawing/2016/5/13/chartex" xmlns:cx8="http://schemas.microsoft.com/office/drawing/2016/5/14/chartex" xmlns:mc="http://schemas.openxmlformats.org/markup-compatibility/2006" xmlns:aink="http://schemas.microsoft.com/office/drawing/2016/ink" xmlns:am3d="http://schemas.microsoft.com/office/drawing/2017/model3d" xmlns:o="urn:schemas-microsoft-com:office:office" xmlns:oel="http://schemas.microsoft.com/office/2019/extlst" xmlns:r="http://schemas.openxmlformats.org/officeDocument/2006/relationships" xmlns:m="http://schemas.openxmlformats.org/officeDocument/2006/math" xmlns:v="urn:schemas-microsoft-com:vml" xmlns:wp14="http://schemas.microsoft.com/office/word/2010/wordprocessingDrawing" xmlns:wp="http://schemas.openxmlformats.org/drawingml/2006/wordprocessingDrawing" xmlns:w10="urn:schemas-microsoft-com:office:word" xmlns:w="http://schemas.openxmlformats.org/wordprocessingml/2006/main" xmlns:w14="http://schemas.microsoft.com/office/word/2010/wordml" xmlns:w15="http://schemas.microsoft.com/office/word/2012/wordml" xmlns:w16cex="http://schemas.microsoft.com/office/word/2018/wordml/cex" xmlns:w16cid="http://schemas.microsoft.com/office/word/2016/wordml/cid" xmlns:w16="http://schemas.microsoft.com/office/word/2018/wordml" xmlns:w16du="http://schemas.microsoft.com/office/word/2023/wordml/word16du" xmlns:w16sdtdh="http://schemas.microsoft.com/office/word/2020/wordml/sdtdatahash" xmlns:w16sdtfl="http://schemas.microsoft.com/office/word/2024/wordml/sdtformatlock" xmlns:w16se="http://schemas.microsoft.com/office/word/2015/wordml/symex" xmlns:wpg="http://schemas.microsoft.com/office/word/2010/wordprocessingGroup" xmlns:wpi="http://schemas.microsoft.com/office/word/2010/wordprocessingInk" xmlns:wne="http://schemas.microsoft.com/office/word/2006/wordml" xmlns:wps="http://schemas.microsoft.com/office/word/2010/wordprocessingShape" mc:Ignorable="w14 w15 w16se w16cid w16 w16cex w16sdtdh w16sdtfl w16du wp14">
+<w:ftr xmlns:wpc="http://schemas.microsoft.com/office/word/2010/wordprocessingCanvas" xmlns:cx="http://schemas.microsoft.com/office/drawing/2014/chartex" xmlns:cx1="http://schemas.microsoft.com/office/drawing/2015/9/8/chartex" xmlns:cx2="http://schemas.microsoft.com/office/drawing/2015/10/21/chartex" xmlns:cx3="http://schemas.microsoft.com/office/drawing/2016/5/9/chartex" xmlns:cx4="http://schemas.microsoft.com/office/drawing/2016/5/10/chartex" xmlns:cx5="http://schemas.microsoft.com/office/drawing/2016/5/11/chartex" xmlns:cx6="http://schemas.microsoft.com/office/drawing/2016/5/12/chartex" xmlns:cx7="http://schemas.microsoft.com/office/drawing/2016/5/13/chartex" xmlns:cx8="http://schemas.microsoft.com/office/drawing/2016/5/14/chartex" xmlns:mc="http://schemas.openxmlformats.org/markup-compatibility/2006" xmlns:aink="http://schemas.microsoft.com/office/drawing/2016/ink" xmlns:am3d="http://schemas.microsoft.com/office/drawing/2017/model3d" xmlns:o="urn:schemas-microsoft-com:office:office" xmlns:oel="http://schemas.microsoft.com/office/2019/extlst" xmlns:r="http://schemas.openxmlformats.org/officeDocument/2006/relationships" xmlns:m="http://schemas.openxmlformats.org/officeDocument/2006/math" xmlns:v="urn:schemas-microsoft-com:vml" xmlns:wp14="http://schemas.microsoft.com/office/word/2010/wordprocessingDrawing" xmlns:wp="http://schemas.openxmlformats.org/drawingml/2006/wordprocessingDrawing" xmlns:w10="urn:schemas-microsoft-com:office:word" xmlns:w="http://schemas.openxmlformats.org/wordprocessingml/2006/main" xmlns:w14="http://schemas.microsoft.com/office/word/2010/wordml" xmlns:w15="http://schemas.microsoft.com/office/word/2012/wordml" xmlns:w16cex="http://schemas.microsoft.com/office/word/2018/wordml/cex" xmlns:w16cid="http://schemas.microsoft.com/office/word/2016/wordml/cid" xmlns:w16="http://schemas.microsoft.com/office/word/2018/wordml" xmlns:w16sdtdh="http://schemas.microsoft.com/office/word/2020/wordml/sdtdatahash" xmlns:w16se="http://schemas.microsoft.com/office/word/2015/wordml/symex" xmlns:wpg="http://schemas.microsoft.com/office/word/2010/wordprocessingGroup" xmlns:wpi="http://schemas.microsoft.com/office/word/2010/wordprocessingInk" xmlns:wne="http://schemas.microsoft.com/office/word/2006/wordml" xmlns:wps="http://schemas.microsoft.com/office/word/2010/wordprocessingShape" mc:Ignorable="w14 w15 w16se w16cid w16 w16cex w16sdtdh wp14">
   <w:p>
     <w:pPr>
       <w:pStyle w:val="Footer"/>
@@ -925,7 +918,7 @@
 </file>
 
 <file path=word/footnotes.xml><?xml version="1.0" encoding="utf-8"?>
-<w:footnotes xmlns:wpc="http://schemas.microsoft.com/office/word/2010/wordprocessingCanvas" xmlns:cx="http://schemas.microsoft.com/office/drawing/2014/chartex" xmlns:cx1="http://schemas.microsoft.com/office/drawing/2015/9/8/chartex" xmlns:cx2="http://schemas.microsoft.com/office/drawing/2015/10/21/chartex" xmlns:cx3="http://schemas.microsoft.com/office/drawing/2016/5/9/chartex" xmlns:cx4="http://schemas.microsoft.com/office/drawing/2016/5/10/chartex" xmlns:cx5="http://schemas.microsoft.com/office/drawing/2016/5/11/chartex" xmlns:cx6="http://schemas.microsoft.com/office/drawing/2016/5/12/chartex" xmlns:cx7="http://schemas.microsoft.com/office/drawing/2016/5/13/chartex" xmlns:cx8="http://schemas.microsoft.com/office/drawing/2016/5/14/chartex" xmlns:mc="http://schemas.openxmlformats.org/markup-compatibility/2006" xmlns:aink="http://schemas.microsoft.com/office/drawing/2016/ink" xmlns:am3d="http://schemas.microsoft.com/office/drawing/2017/model3d" xmlns:o="urn:schemas-microsoft-com:office:office" xmlns:oel="http://schemas.microsoft.com/office/2019/extlst" xmlns:r="http://schemas.openxmlformats.org/officeDocument/2006/relationships" xmlns:m="http://schemas.openxmlformats.org/officeDocument/2006/math" xmlns:v="urn:schemas-microsoft-com:vml" xmlns:wp14="http://schemas.microsoft.com/office/word/2010/wordprocessingDrawing" xmlns:wp="http://schemas.openxmlformats.org/drawingml/2006/wordprocessingDrawing" xmlns:w10="urn:schemas-microsoft-com:office:word" xmlns:w="http://schemas.openxmlformats.org/wordprocessingml/2006/main" xmlns:w14="http://schemas.microsoft.com/office/word/2010/wordml" xmlns:w15="http://schemas.microsoft.com/office/word/2012/wordml" xmlns:w16cex="http://schemas.microsoft.com/office/word/2018/wordml/cex" xmlns:w16cid="http://schemas.microsoft.com/office/word/2016/wordml/cid" xmlns:w16="http://schemas.microsoft.com/office/word/2018/wordml" xmlns:w16du="http://schemas.microsoft.com/office/word/2023/wordml/word16du" xmlns:w16sdtdh="http://schemas.microsoft.com/office/word/2020/wordml/sdtdatahash" xmlns:w16sdtfl="http://schemas.microsoft.com/office/word/2024/wordml/sdtformatlock" xmlns:w16se="http://schemas.microsoft.com/office/word/2015/wordml/symex" xmlns:wpg="http://schemas.microsoft.com/office/word/2010/wordprocessingGroup" xmlns:wpi="http://schemas.microsoft.com/office/word/2010/wordprocessingInk" xmlns:wne="http://schemas.microsoft.com/office/word/2006/wordml" xmlns:wps="http://schemas.microsoft.com/office/word/2010/wordprocessingShape" mc:Ignorable="w14 w15 w16se w16cid w16 w16cex w16sdtdh w16sdtfl w16du wp14">
+<w:footnotes xmlns:wpc="http://schemas.microsoft.com/office/word/2010/wordprocessingCanvas" xmlns:cx="http://schemas.microsoft.com/office/drawing/2014/chartex" xmlns:cx1="http://schemas.microsoft.com/office/drawing/2015/9/8/chartex" xmlns:cx2="http://schemas.microsoft.com/office/drawing/2015/10/21/chartex" xmlns:cx3="http://schemas.microsoft.com/office/drawing/2016/5/9/chartex" xmlns:cx4="http://schemas.microsoft.com/office/drawing/2016/5/10/chartex" xmlns:cx5="http://schemas.microsoft.com/office/drawing/2016/5/11/chartex" xmlns:cx6="http://schemas.microsoft.com/office/drawing/2016/5/12/chartex" xmlns:cx7="http://schemas.microsoft.com/office/drawing/2016/5/13/chartex" xmlns:cx8="http://schemas.microsoft.com/office/drawing/2016/5/14/chartex" xmlns:mc="http://schemas.openxmlformats.org/markup-compatibility/2006" xmlns:aink="http://schemas.microsoft.com/office/drawing/2016/ink" xmlns:am3d="http://schemas.microsoft.com/office/drawing/2017/model3d" xmlns:o="urn:schemas-microsoft-com:office:office" xmlns:oel="http://schemas.microsoft.com/office/2019/extlst" xmlns:r="http://schemas.openxmlformats.org/officeDocument/2006/relationships" xmlns:m="http://schemas.openxmlformats.org/officeDocument/2006/math" xmlns:v="urn:schemas-microsoft-com:vml" xmlns:wp14="http://schemas.microsoft.com/office/word/2010/wordprocessingDrawing" xmlns:wp="http://schemas.openxmlformats.org/drawingml/2006/wordprocessingDrawing" xmlns:w10="urn:schemas-microsoft-com:office:word" xmlns:w="http://schemas.openxmlformats.org/wordprocessingml/2006/main" xmlns:w14="http://schemas.microsoft.com/office/word/2010/wordml" xmlns:w15="http://schemas.microsoft.com/office/word/2012/wordml" xmlns:w16cex="http://schemas.microsoft.com/office/word/2018/wordml/cex" xmlns:w16cid="http://schemas.microsoft.com/office/word/2016/wordml/cid" xmlns:w16="http://schemas.microsoft.com/office/word/2018/wordml" xmlns:w16sdtdh="http://schemas.microsoft.com/office/word/2020/wordml/sdtdatahash" xmlns:w16se="http://schemas.microsoft.com/office/word/2015/wordml/symex" xmlns:wpg="http://schemas.microsoft.com/office/word/2010/wordprocessingGroup" xmlns:wpi="http://schemas.microsoft.com/office/word/2010/wordprocessingInk" xmlns:wne="http://schemas.microsoft.com/office/word/2006/wordml" xmlns:wps="http://schemas.microsoft.com/office/word/2010/wordprocessingShape" mc:Ignorable="w14 w15 w16se w16cid w16 w16cex w16sdtdh wp14">
   <w:footnote w:type="separator" w:id="-1">
     <w:p>
       <w:pPr>
@@ -957,7 +950,7 @@
 </file>
 
 <file path=word/header1.xml><?xml version="1.0" encoding="utf-8"?>
-<w:hdr xmlns:wpc="http://schemas.microsoft.com/office/word/2010/wordprocessingCanvas" xmlns:cx="http://schemas.microsoft.com/office/drawing/2014/chartex" xmlns:cx1="http://schemas.microsoft.com/office/drawing/2015/9/8/chartex" xmlns:cx2="http://schemas.microsoft.com/office/drawing/2015/10/21/chartex" xmlns:cx3="http://schemas.microsoft.com/office/drawing/2016/5/9/chartex" xmlns:cx4="http://schemas.microsoft.com/office/drawing/2016/5/10/chartex" xmlns:cx5="http://schemas.microsoft.com/office/drawing/2016/5/11/chartex" xmlns:cx6="http://schemas.microsoft.com/office/drawing/2016/5/12/chartex" xmlns:cx7="http://schemas.microsoft.com/office/drawing/2016/5/13/chartex" xmlns:cx8="http://schemas.microsoft.com/office/drawing/2016/5/14/chartex" xmlns:mc="http://schemas.openxmlformats.org/markup-compatibility/2006" xmlns:aink="http://schemas.microsoft.com/office/drawing/2016/ink" xmlns:am3d="http://schemas.microsoft.com/office/drawing/2017/model3d" xmlns:o="urn:schemas-microsoft-com:office:office" xmlns:oel="http://schemas.microsoft.com/office/2019/extlst" xmlns:r="http://schemas.openxmlformats.org/officeDocument/2006/relationships" xmlns:m="http://schemas.openxmlformats.org/officeDocument/2006/math" xmlns:v="urn:schemas-microsoft-com:vml" xmlns:wp14="http://schemas.microsoft.com/office/word/2010/wordprocessingDrawing" xmlns:wp="http://schemas.openxmlformats.org/drawingml/2006/wordprocessingDrawing" xmlns:w10="urn:schemas-microsoft-com:office:word" xmlns:w="http://schemas.openxmlformats.org/wordprocessingml/2006/main" xmlns:w14="http://schemas.microsoft.com/office/word/2010/wordml" xmlns:w15="http://schemas.microsoft.com/office/word/2012/wordml" xmlns:w16cex="http://schemas.microsoft.com/office/word/2018/wordml/cex" xmlns:w16cid="http://schemas.microsoft.com/office/word/2016/wordml/cid" xmlns:w16="http://schemas.microsoft.com/office/word/2018/wordml" xmlns:w16du="http://schemas.microsoft.com/office/word/2023/wordml/word16du" xmlns:w16sdtdh="http://schemas.microsoft.com/office/word/2020/wordml/sdtdatahash" xmlns:w16sdtfl="http://schemas.microsoft.com/office/word/2024/wordml/sdtformatlock" xmlns:w16se="http://schemas.microsoft.com/office/word/2015/wordml/symex" xmlns:wpg="http://schemas.microsoft.com/office/word/2010/wordprocessingGroup" xmlns:wpi="http://schemas.microsoft.com/office/word/2010/wordprocessingInk" xmlns:wne="http://schemas.microsoft.com/office/word/2006/wordml" xmlns:wps="http://schemas.microsoft.com/office/word/2010/wordprocessingShape" mc:Ignorable="w14 w15 w16se w16cid w16 w16cex w16sdtdh w16sdtfl w16du wp14">
+<w:hdr xmlns:wpc="http://schemas.microsoft.com/office/word/2010/wordprocessingCanvas" xmlns:cx="http://schemas.microsoft.com/office/drawing/2014/chartex" xmlns:cx1="http://schemas.microsoft.com/office/drawing/2015/9/8/chartex" xmlns:cx2="http://schemas.microsoft.com/office/drawing/2015/10/21/chartex" xmlns:cx3="http://schemas.microsoft.com/office/drawing/2016/5/9/chartex" xmlns:cx4="http://schemas.microsoft.com/office/drawing/2016/5/10/chartex" xmlns:cx5="http://schemas.microsoft.com/office/drawing/2016/5/11/chartex" xmlns:cx6="http://schemas.microsoft.com/office/drawing/2016/5/12/chartex" xmlns:cx7="http://schemas.microsoft.com/office/drawing/2016/5/13/chartex" xmlns:cx8="http://schemas.microsoft.com/office/drawing/2016/5/14/chartex" xmlns:mc="http://schemas.openxmlformats.org/markup-compatibility/2006" xmlns:aink="http://schemas.microsoft.com/office/drawing/2016/ink" xmlns:am3d="http://schemas.microsoft.com/office/drawing/2017/model3d" xmlns:o="urn:schemas-microsoft-com:office:office" xmlns:oel="http://schemas.microsoft.com/office/2019/extlst" xmlns:r="http://schemas.openxmlformats.org/officeDocument/2006/relationships" xmlns:m="http://schemas.openxmlformats.org/officeDocument/2006/math" xmlns:v="urn:schemas-microsoft-com:vml" xmlns:wp14="http://schemas.microsoft.com/office/word/2010/wordprocessingDrawing" xmlns:wp="http://schemas.openxmlformats.org/drawingml/2006/wordprocessingDrawing" xmlns:w10="urn:schemas-microsoft-com:office:word" xmlns:w="http://schemas.openxmlformats.org/wordprocessingml/2006/main" xmlns:w14="http://schemas.microsoft.com/office/word/2010/wordml" xmlns:w15="http://schemas.microsoft.com/office/word/2012/wordml" xmlns:w16cex="http://schemas.microsoft.com/office/word/2018/wordml/cex" xmlns:w16cid="http://schemas.microsoft.com/office/word/2016/wordml/cid" xmlns:w16="http://schemas.microsoft.com/office/word/2018/wordml" xmlns:w16sdtdh="http://schemas.microsoft.com/office/word/2020/wordml/sdtdatahash" xmlns:w16se="http://schemas.microsoft.com/office/word/2015/wordml/symex" xmlns:wpg="http://schemas.microsoft.com/office/word/2010/wordprocessingGroup" xmlns:wpi="http://schemas.microsoft.com/office/word/2010/wordprocessingInk" xmlns:wne="http://schemas.microsoft.com/office/word/2006/wordml" xmlns:wps="http://schemas.microsoft.com/office/word/2010/wordprocessingShape" mc:Ignorable="w14 w15 w16se w16cid w16 w16cex w16sdtdh wp14">
   <w:p>
     <w:pPr>
       <w:pStyle w:val="Header"/>
@@ -967,7 +960,7 @@
 </file>
 
 <file path=word/header2.xml><?xml version="1.0" encoding="utf-8"?>
-<w:hdr xmlns:wpc="http://schemas.microsoft.com/office/word/2010/wordprocessingCanvas" xmlns:cx="http://schemas.microsoft.com/office/drawing/2014/chartex" xmlns:cx1="http://schemas.microsoft.com/office/drawing/2015/9/8/chartex" xmlns:cx2="http://schemas.microsoft.com/office/drawing/2015/10/21/chartex" xmlns:cx3="http://schemas.microsoft.com/office/drawing/2016/5/9/chartex" xmlns:cx4="http://schemas.microsoft.com/office/drawing/2016/5/10/chartex" xmlns:cx5="http://schemas.microsoft.com/office/drawing/2016/5/11/chartex" xmlns:cx6="http://schemas.microsoft.com/office/drawing/2016/5/12/chartex" xmlns:cx7="http://schemas.microsoft.com/office/drawing/2016/5/13/chartex" xmlns:cx8="http://schemas.microsoft.com/office/drawing/2016/5/14/chartex" xmlns:mc="http://schemas.openxmlformats.org/markup-compatibility/2006" xmlns:aink="http://schemas.microsoft.com/office/drawing/2016/ink" xmlns:am3d="http://schemas.microsoft.com/office/drawing/2017/model3d" xmlns:o="urn:schemas-microsoft-com:office:office" xmlns:oel="http://schemas.microsoft.com/office/2019/extlst" xmlns:r="http://schemas.openxmlformats.org/officeDocument/2006/relationships" xmlns:m="http://schemas.openxmlformats.org/officeDocument/2006/math" xmlns:v="urn:schemas-microsoft-com:vml" xmlns:wp14="http://schemas.microsoft.com/office/word/2010/wordprocessingDrawing" xmlns:wp="http://schemas.openxmlformats.org/drawingml/2006/wordprocessingDrawing" xmlns:w10="urn:schemas-microsoft-com:office:word" xmlns:w="http://schemas.openxmlformats.org/wordprocessingml/2006/main" xmlns:w14="http://schemas.microsoft.com/office/word/2010/wordml" xmlns:w15="http://schemas.microsoft.com/office/word/2012/wordml" xmlns:w16cex="http://schemas.microsoft.com/office/word/2018/wordml/cex" xmlns:w16cid="http://schemas.microsoft.com/office/word/2016/wordml/cid" xmlns:w16="http://schemas.microsoft.com/office/word/2018/wordml" xmlns:w16du="http://schemas.microsoft.com/office/word/2023/wordml/word16du" xmlns:w16sdtdh="http://schemas.microsoft.com/office/word/2020/wordml/sdtdatahash" xmlns:w16sdtfl="http://schemas.microsoft.com/office/word/2024/wordml/sdtformatlock" xmlns:w16se="http://schemas.microsoft.com/office/word/2015/wordml/symex" xmlns:wpg="http://schemas.microsoft.com/office/word/2010/wordprocessingGroup" xmlns:wpi="http://schemas.microsoft.com/office/word/2010/wordprocessingInk" xmlns:wne="http://schemas.microsoft.com/office/word/2006/wordml" xmlns:wps="http://schemas.microsoft.com/office/word/2010/wordprocessingShape" mc:Ignorable="w14 w15 w16se w16cid w16 w16cex w16sdtdh w16sdtfl w16du wp14">
+<w:hdr xmlns:wpc="http://schemas.microsoft.com/office/word/2010/wordprocessingCanvas" xmlns:cx="http://schemas.microsoft.com/office/drawing/2014/chartex" xmlns:cx1="http://schemas.microsoft.com/office/drawing/2015/9/8/chartex" xmlns:cx2="http://schemas.microsoft.com/office/drawing/2015/10/21/chartex" xmlns:cx3="http://schemas.microsoft.com/office/drawing/2016/5/9/chartex" xmlns:cx4="http://schemas.microsoft.com/office/drawing/2016/5/10/chartex" xmlns:cx5="http://schemas.microsoft.com/office/drawing/2016/5/11/chartex" xmlns:cx6="http://schemas.microsoft.com/office/drawing/2016/5/12/chartex" xmlns:cx7="http://schemas.microsoft.com/office/drawing/2016/5/13/chartex" xmlns:cx8="http://schemas.microsoft.com/office/drawing/2016/5/14/chartex" xmlns:mc="http://schemas.openxmlformats.org/markup-compatibility/2006" xmlns:aink="http://schemas.microsoft.com/office/drawing/2016/ink" xmlns:am3d="http://schemas.microsoft.com/office/drawing/2017/model3d" xmlns:o="urn:schemas-microsoft-com:office:office" xmlns:oel="http://schemas.microsoft.com/office/2019/extlst" xmlns:r="http://schemas.openxmlformats.org/officeDocument/2006/relationships" xmlns:m="http://schemas.openxmlformats.org/officeDocument/2006/math" xmlns:v="urn:schemas-microsoft-com:vml" xmlns:wp14="http://schemas.microsoft.com/office/word/2010/wordprocessingDrawing" xmlns:wp="http://schemas.openxmlformats.org/drawingml/2006/wordprocessingDrawing" xmlns:w10="urn:schemas-microsoft-com:office:word" xmlns:w="http://schemas.openxmlformats.org/wordprocessingml/2006/main" xmlns:w14="http://schemas.microsoft.com/office/word/2010/wordml" xmlns:w15="http://schemas.microsoft.com/office/word/2012/wordml" xmlns:w16cex="http://schemas.microsoft.com/office/word/2018/wordml/cex" xmlns:w16cid="http://schemas.microsoft.com/office/word/2016/wordml/cid" xmlns:w16="http://schemas.microsoft.com/office/word/2018/wordml" xmlns:w16sdtdh="http://schemas.microsoft.com/office/word/2020/wordml/sdtdatahash" xmlns:w16se="http://schemas.microsoft.com/office/word/2015/wordml/symex" xmlns:wpg="http://schemas.microsoft.com/office/word/2010/wordprocessingGroup" xmlns:wpi="http://schemas.microsoft.com/office/word/2010/wordprocessingInk" xmlns:wne="http://schemas.microsoft.com/office/word/2006/wordml" xmlns:wps="http://schemas.microsoft.com/office/word/2010/wordprocessingShape" mc:Ignorable="w14 w15 w16se w16cid w16 w16cex w16sdtdh wp14">
   <w:p>
     <w:pPr>
       <w:pStyle w:val="Header"/>
@@ -977,7 +970,7 @@
 </file>
 
 <file path=word/header3.xml><?xml version="1.0" encoding="utf-8"?>
-<w:hdr xmlns:wpc="http://schemas.microsoft.com/office/word/2010/wordprocessingCanvas" xmlns:cx="http://schemas.microsoft.com/office/drawing/2014/chartex" xmlns:cx1="http://schemas.microsoft.com/office/drawing/2015/9/8/chartex" xmlns:cx2="http://schemas.microsoft.com/office/drawing/2015/10/21/chartex" xmlns:cx3="http://schemas.microsoft.com/office/drawing/2016/5/9/chartex" xmlns:cx4="http://schemas.microsoft.com/office/drawing/2016/5/10/chartex" xmlns:cx5="http://schemas.microsoft.com/office/drawing/2016/5/11/chartex" xmlns:cx6="http://schemas.microsoft.com/office/drawing/2016/5/12/chartex" xmlns:cx7="http://schemas.microsoft.com/office/drawing/2016/5/13/chartex" xmlns:cx8="http://schemas.microsoft.com/office/drawing/2016/5/14/chartex" xmlns:mc="http://schemas.openxmlformats.org/markup-compatibility/2006" xmlns:aink="http://schemas.microsoft.com/office/drawing/2016/ink" xmlns:am3d="http://schemas.microsoft.com/office/drawing/2017/model3d" xmlns:o="urn:schemas-microsoft-com:office:office" xmlns:oel="http://schemas.microsoft.com/office/2019/extlst" xmlns:r="http://schemas.openxmlformats.org/officeDocument/2006/relationships" xmlns:m="http://schemas.openxmlformats.org/officeDocument/2006/math" xmlns:v="urn:schemas-microsoft-com:vml" xmlns:wp14="http://schemas.microsoft.com/office/word/2010/wordprocessingDrawing" xmlns:wp="http://schemas.openxmlformats.org/drawingml/2006/wordprocessingDrawing" xmlns:w10="urn:schemas-microsoft-com:office:word" xmlns:w="http://schemas.openxmlformats.org/wordprocessingml/2006/main" xmlns:w14="http://schemas.microsoft.com/office/word/2010/wordml" xmlns:w15="http://schemas.microsoft.com/office/word/2012/wordml" xmlns:w16cex="http://schemas.microsoft.com/office/word/2018/wordml/cex" xmlns:w16cid="http://schemas.microsoft.com/office/word/2016/wordml/cid" xmlns:w16="http://schemas.microsoft.com/office/word/2018/wordml" xmlns:w16du="http://schemas.microsoft.com/office/word/2023/wordml/word16du" xmlns:w16sdtdh="http://schemas.microsoft.com/office/word/2020/wordml/sdtdatahash" xmlns:w16sdtfl="http://schemas.microsoft.com/office/word/2024/wordml/sdtformatlock" xmlns:w16se="http://schemas.microsoft.com/office/word/2015/wordml/symex" xmlns:wpg="http://schemas.microsoft.com/office/word/2010/wordprocessingGroup" xmlns:wpi="http://schemas.microsoft.com/office/word/2010/wordprocessingInk" xmlns:wne="http://schemas.microsoft.com/office/word/2006/wordml" xmlns:wps="http://schemas.microsoft.com/office/word/2010/wordprocessingShape" mc:Ignorable="w14 w15 w16se w16cid w16 w16cex w16sdtdh w16sdtfl w16du wp14">
+<w:hdr xmlns:wpc="http://schemas.microsoft.com/office/word/2010/wordprocessingCanvas" xmlns:cx="http://schemas.microsoft.com/office/drawing/2014/chartex" xmlns:cx1="http://schemas.microsoft.com/office/drawing/2015/9/8/chartex" xmlns:cx2="http://schemas.microsoft.com/office/drawing/2015/10/21/chartex" xmlns:cx3="http://schemas.microsoft.com/office/drawing/2016/5/9/chartex" xmlns:cx4="http://schemas.microsoft.com/office/drawing/2016/5/10/chartex" xmlns:cx5="http://schemas.microsoft.com/office/drawing/2016/5/11/chartex" xmlns:cx6="http://schemas.microsoft.com/office/drawing/2016/5/12/chartex" xmlns:cx7="http://schemas.microsoft.com/office/drawing/2016/5/13/chartex" xmlns:cx8="http://schemas.microsoft.com/office/drawing/2016/5/14/chartex" xmlns:mc="http://schemas.openxmlformats.org/markup-compatibility/2006" xmlns:aink="http://schemas.microsoft.com/office/drawing/2016/ink" xmlns:am3d="http://schemas.microsoft.com/office/drawing/2017/model3d" xmlns:o="urn:schemas-microsoft-com:office:office" xmlns:oel="http://schemas.microsoft.com/office/2019/extlst" xmlns:r="http://schemas.openxmlformats.org/officeDocument/2006/relationships" xmlns:m="http://schemas.openxmlformats.org/officeDocument/2006/math" xmlns:v="urn:schemas-microsoft-com:vml" xmlns:wp14="http://schemas.microsoft.com/office/word/2010/wordprocessingDrawing" xmlns:wp="http://schemas.openxmlformats.org/drawingml/2006/wordprocessingDrawing" xmlns:w10="urn:schemas-microsoft-com:office:word" xmlns:w="http://schemas.openxmlformats.org/wordprocessingml/2006/main" xmlns:w14="http://schemas.microsoft.com/office/word/2010/wordml" xmlns:w15="http://schemas.microsoft.com/office/word/2012/wordml" xmlns:w16cex="http://schemas.microsoft.com/office/word/2018/wordml/cex" xmlns:w16cid="http://schemas.microsoft.com/office/word/2016/wordml/cid" xmlns:w16="http://schemas.microsoft.com/office/word/2018/wordml" xmlns:w16sdtdh="http://schemas.microsoft.com/office/word/2020/wordml/sdtdatahash" xmlns:w16se="http://schemas.microsoft.com/office/word/2015/wordml/symex" xmlns:wpg="http://schemas.microsoft.com/office/word/2010/wordprocessingGroup" xmlns:wpi="http://schemas.microsoft.com/office/word/2010/wordprocessingInk" xmlns:wne="http://schemas.microsoft.com/office/word/2006/wordml" xmlns:wps="http://schemas.microsoft.com/office/word/2010/wordprocessingShape" mc:Ignorable="w14 w15 w16se w16cid w16 w16cex w16sdtdh wp14">
   <w:p>
     <w:pPr>
       <w:pStyle w:val="Header"/>
@@ -987,7 +980,7 @@
 </file>
 
 <file path=word/numbering.xml><?xml version="1.0" encoding="utf-8"?>
-<w:numbering xmlns:wpc="http://schemas.microsoft.com/office/word/2010/wordprocessingCanvas" xmlns:cx="http://schemas.microsoft.com/office/drawing/2014/chartex" xmlns:cx1="http://schemas.microsoft.com/office/drawing/2015/9/8/chartex" xmlns:cx2="http://schemas.microsoft.com/office/drawing/2015/10/21/chartex" xmlns:cx3="http://schemas.microsoft.com/office/drawing/2016/5/9/chartex" xmlns:cx4="http://schemas.microsoft.com/office/drawing/2016/5/10/chartex" xmlns:cx5="http://schemas.microsoft.com/office/drawing/2016/5/11/chartex" xmlns:cx6="http://schemas.microsoft.com/office/drawing/2016/5/12/chartex" xmlns:cx7="http://schemas.microsoft.com/office/drawing/2016/5/13/chartex" xmlns:cx8="http://schemas.microsoft.com/office/drawing/2016/5/14/chartex" xmlns:mc="http://schemas.openxmlformats.org/markup-compatibility/2006" xmlns:aink="http://schemas.microsoft.com/office/drawing/2016/ink" xmlns:am3d="http://schemas.microsoft.com/office/drawing/2017/model3d" xmlns:o="urn:schemas-microsoft-com:office:office" xmlns:oel="http://schemas.microsoft.com/office/2019/extlst" xmlns:r="http://schemas.openxmlformats.org/officeDocument/2006/relationships" xmlns:m="http://schemas.openxmlformats.org/officeDocument/2006/math" xmlns:v="urn:schemas-microsoft-com:vml" xmlns:wp14="http://schemas.microsoft.com/office/word/2010/wordprocessingDrawing" xmlns:wp="http://schemas.openxmlformats.org/drawingml/2006/wordprocessingDrawing" xmlns:w10="urn:schemas-microsoft-com:office:word" xmlns:w="http://schemas.openxmlformats.org/wordprocessingml/2006/main" xmlns:w14="http://schemas.microsoft.com/office/word/2010/wordml" xmlns:w15="http://schemas.microsoft.com/office/word/2012/wordml" xmlns:w16cex="http://schemas.microsoft.com/office/word/2018/wordml/cex" xmlns:w16cid="http://schemas.microsoft.com/office/word/2016/wordml/cid" xmlns:w16="http://schemas.microsoft.com/office/word/2018/wordml" xmlns:w16du="http://schemas.microsoft.com/office/word/2023/wordml/word16du" xmlns:w16sdtdh="http://schemas.microsoft.com/office/word/2020/wordml/sdtdatahash" xmlns:w16sdtfl="http://schemas.microsoft.com/office/word/2024/wordml/sdtformatlock" xmlns:w16se="http://schemas.microsoft.com/office/word/2015/wordml/symex" xmlns:wpg="http://schemas.microsoft.com/office/word/2010/wordprocessingGroup" xmlns:wpi="http://schemas.microsoft.com/office/word/2010/wordprocessingInk" xmlns:wne="http://schemas.microsoft.com/office/word/2006/wordml" xmlns:wps="http://schemas.microsoft.com/office/word/2010/wordprocessingShape" mc:Ignorable="w14 w15 w16se w16cid w16 w16cex w16sdtdh w16sdtfl w16du wp14">
+<w:numbering xmlns:wpc="http://schemas.microsoft.com/office/word/2010/wordprocessingCanvas" xmlns:cx="http://schemas.microsoft.com/office/drawing/2014/chartex" xmlns:cx1="http://schemas.microsoft.com/office/drawing/2015/9/8/chartex" xmlns:cx2="http://schemas.microsoft.com/office/drawing/2015/10/21/chartex" xmlns:cx3="http://schemas.microsoft.com/office/drawing/2016/5/9/chartex" xmlns:cx4="http://schemas.microsoft.com/office/drawing/2016/5/10/chartex" xmlns:cx5="http://schemas.microsoft.com/office/drawing/2016/5/11/chartex" xmlns:cx6="http://schemas.microsoft.com/office/drawing/2016/5/12/chartex" xmlns:cx7="http://schemas.microsoft.com/office/drawing/2016/5/13/chartex" xmlns:cx8="http://schemas.microsoft.com/office/drawing/2016/5/14/chartex" xmlns:mc="http://schemas.openxmlformats.org/markup-compatibility/2006" xmlns:aink="http://schemas.microsoft.com/office/drawing/2016/ink" xmlns:am3d="http://schemas.microsoft.com/office/drawing/2017/model3d" xmlns:o="urn:schemas-microsoft-com:office:office" xmlns:oel="http://schemas.microsoft.com/office/2019/extlst" xmlns:r="http://schemas.openxmlformats.org/officeDocument/2006/relationships" xmlns:m="http://schemas.openxmlformats.org/officeDocument/2006/math" xmlns:v="urn:schemas-microsoft-com:vml" xmlns:wp14="http://schemas.microsoft.com/office/word/2010/wordprocessingDrawing" xmlns:wp="http://schemas.openxmlformats.org/drawingml/2006/wordprocessingDrawing" xmlns:w10="urn:schemas-microsoft-com:office:word" xmlns:w="http://schemas.openxmlformats.org/wordprocessingml/2006/main" xmlns:w14="http://schemas.microsoft.com/office/word/2010/wordml" xmlns:w15="http://schemas.microsoft.com/office/word/2012/wordml" xmlns:w16cex="http://schemas.microsoft.com/office/word/2018/wordml/cex" xmlns:w16cid="http://schemas.microsoft.com/office/word/2016/wordml/cid" xmlns:w16="http://schemas.microsoft.com/office/word/2018/wordml" xmlns:w16sdtdh="http://schemas.microsoft.com/office/word/2020/wordml/sdtdatahash" xmlns:w16se="http://schemas.microsoft.com/office/word/2015/wordml/symex" xmlns:wpg="http://schemas.microsoft.com/office/word/2010/wordprocessingGroup" xmlns:wpi="http://schemas.microsoft.com/office/word/2010/wordprocessingInk" xmlns:wne="http://schemas.microsoft.com/office/word/2006/wordml" xmlns:wps="http://schemas.microsoft.com/office/word/2010/wordprocessingShape" mc:Ignorable="w14 w15 w16se w16cid w16 w16cex w16sdtdh wp14">
   <w:abstractNum w:abstractNumId="0" w15:restartNumberingAfterBreak="0">
     <w:nsid w:val="11005EF4"/>
     <w:multiLevelType w:val="hybridMultilevel"/>
@@ -1379,7 +1372,7 @@
 </file>
 
 <file path=word/styles.xml><?xml version="1.0" encoding="utf-8"?>
-<w:styles xmlns:mc="http://schemas.openxmlformats.org/markup-compatibility/2006" xmlns:r="http://schemas.openxmlformats.org/officeDocument/2006/relationships" xmlns:w="http://schemas.openxmlformats.org/wordprocessingml/2006/main" xmlns:w14="http://schemas.microsoft.com/office/word/2010/wordml" xmlns:w15="http://schemas.microsoft.com/office/word/2012/wordml" xmlns:w16cex="http://schemas.microsoft.com/office/word/2018/wordml/cex" xmlns:w16cid="http://schemas.microsoft.com/office/word/2016/wordml/cid" xmlns:w16="http://schemas.microsoft.com/office/word/2018/wordml" xmlns:w16du="http://schemas.microsoft.com/office/word/2023/wordml/word16du" xmlns:w16sdtdh="http://schemas.microsoft.com/office/word/2020/wordml/sdtdatahash" xmlns:w16sdtfl="http://schemas.microsoft.com/office/word/2024/wordml/sdtformatlock" xmlns:w16se="http://schemas.microsoft.com/office/word/2015/wordml/symex" mc:Ignorable="w14 w15 w16se w16cid w16 w16cex w16sdtdh w16sdtfl w16du">
+<w:styles xmlns:mc="http://schemas.openxmlformats.org/markup-compatibility/2006" xmlns:r="http://schemas.openxmlformats.org/officeDocument/2006/relationships" xmlns:w="http://schemas.openxmlformats.org/wordprocessingml/2006/main" xmlns:w14="http://schemas.microsoft.com/office/word/2010/wordml" xmlns:w15="http://schemas.microsoft.com/office/word/2012/wordml" xmlns:w16cex="http://schemas.microsoft.com/office/word/2018/wordml/cex" xmlns:w16cid="http://schemas.microsoft.com/office/word/2016/wordml/cid" xmlns:w16="http://schemas.microsoft.com/office/word/2018/wordml" xmlns:w16sdtdh="http://schemas.microsoft.com/office/word/2020/wordml/sdtdatahash" xmlns:w16se="http://schemas.microsoft.com/office/word/2015/wordml/symex" mc:Ignorable="w14 w15 w16se w16cid w16 w16cex w16sdtdh">
   <w:docDefaults>
     <w:rPrDefault>
       <w:rPr>
@@ -2131,7 +2124,7 @@
       </w:rPr>
     </w:tblStylePr>
   </w:style>
-  <w:style w:type="table" w:styleId="GridTable6Colorful">
+  <w:style w:type="table" w:styleId="GridTable6Colourful">
     <w:name w:val="Grid Table 6 Colorful"/>
     <w:basedOn w:val="TableNormal"/>
     <w:uiPriority w:val="51"/>
@@ -2788,12 +2781,6 @@
 </file>
 
 <file path=customXml/item1.xml><?xml version="1.0" encoding="utf-8"?>
-<p:properties xmlns:p="http://schemas.microsoft.com/office/2006/metadata/properties" xmlns:xsi="http://www.w3.org/2001/XMLSchema-instance" xmlns:pc="http://schemas.microsoft.com/office/infopath/2007/PartnerControls">
-  <documentManagement/>
-</p:properties>
-</file>
-
-<file path=customXml/item2.xml><?xml version="1.0" encoding="utf-8"?>
 <?mso-contentType ?>
 <FormTemplates xmlns="http://schemas.microsoft.com/sharepoint/v3/contenttype/forms">
   <Display>DocumentLibraryForm</Display>
@@ -2802,7 +2789,17 @@
 </FormTemplates>
 </file>
 
+<file path=customXml/item2.xml><?xml version="1.0" encoding="utf-8"?>
+<p:properties xmlns:p="http://schemas.microsoft.com/office/2006/metadata/properties" xmlns:xsi="http://www.w3.org/2001/XMLSchema-instance" xmlns:pc="http://schemas.microsoft.com/office/infopath/2007/PartnerControls">
+  <documentManagement/>
+</p:properties>
+</file>
+
 <file path=customXml/item3.xml><?xml version="1.0" encoding="utf-8"?>
+<b:Sources xmlns:b="http://schemas.openxmlformats.org/officeDocument/2006/bibliography" xmlns="http://schemas.openxmlformats.org/officeDocument/2006/bibliography" SelectedStyle="\APASixthEditionOfficeOnline.xsl" StyleName="APA" Version="6"/>
+</file>
+
+<file path=customXml/item4.xml><?xml version="1.0" encoding="utf-8"?>
 <ct:contentTypeSchema xmlns:ct="http://schemas.microsoft.com/office/2006/metadata/contentType" xmlns:ma="http://schemas.microsoft.com/office/2006/metadata/properties/metaAttributes" ct:_="" ma:_="" ma:contentTypeName="Document" ma:contentTypeID="0x01010051A328A96253EC468854895DB51C3CA9" ma:contentTypeVersion="12" ma:contentTypeDescription="Create a new document." ma:contentTypeScope="" ma:versionID="70ca04a2727be2bcabd6e8d4d48cd64c">
   <xsd:schema xmlns:xsd="http://www.w3.org/2001/XMLSchema" xmlns:xs="http://www.w3.org/2001/XMLSchema" xmlns:p="http://schemas.microsoft.com/office/2006/metadata/properties" xmlns:ns2="606370cc-c8d9-4222-8a4e-3c320f1e3034" xmlns:ns3="bf6b85bd-8a7e-4854-be4d-0780382295a8" targetNamespace="http://schemas.microsoft.com/office/2006/metadata/properties" ma:root="true" ma:fieldsID="153e2816b688b383ad24b8974a641912" ns2:_="" ns3:_="">
     <xsd:import namespace="606370cc-c8d9-4222-8a4e-3c320f1e3034"/>
@@ -3019,11 +3016,15 @@
 </ct:contentTypeSchema>
 </file>
 
-<file path=customXml/item4.xml><?xml version="1.0" encoding="utf-8"?>
-<b:Sources xmlns:b="http://schemas.openxmlformats.org/officeDocument/2006/bibliography" xmlns="http://schemas.openxmlformats.org/officeDocument/2006/bibliography" SelectedStyle="\APASixthEditionOfficeOnline.xsl" StyleName="APA" Version="6"/>
+<file path=customXml/itemProps1.xml><?xml version="1.0" encoding="utf-8"?>
+<ds:datastoreItem xmlns:ds="http://schemas.openxmlformats.org/officeDocument/2006/customXml" ds:itemID="{D43A2629-88B9-483E-9D98-8FE0E77A3D20}">
+  <ds:schemaRefs>
+    <ds:schemaRef ds:uri="http://schemas.microsoft.com/sharepoint/v3/contenttype/forms"/>
+  </ds:schemaRefs>
+</ds:datastoreItem>
 </file>
 
-<file path=customXml/itemProps1.xml><?xml version="1.0" encoding="utf-8"?>
+<file path=customXml/itemProps2.xml><?xml version="1.0" encoding="utf-8"?>
 <ds:datastoreItem xmlns:ds="http://schemas.openxmlformats.org/officeDocument/2006/customXml" ds:itemID="{B0D4FDE7-3BA6-4516-A105-B680184AC85B}">
   <ds:schemaRefs>
     <ds:schemaRef ds:uri="http://schemas.microsoft.com/office/2006/metadata/properties"/>
@@ -3032,15 +3033,15 @@
 </ds:datastoreItem>
 </file>
 
-<file path=customXml/itemProps2.xml><?xml version="1.0" encoding="utf-8"?>
-<ds:datastoreItem xmlns:ds="http://schemas.openxmlformats.org/officeDocument/2006/customXml" ds:itemID="{D43A2629-88B9-483E-9D98-8FE0E77A3D20}">
+<file path=customXml/itemProps3.xml><?xml version="1.0" encoding="utf-8"?>
+<ds:datastoreItem xmlns:ds="http://schemas.openxmlformats.org/officeDocument/2006/customXml" ds:itemID="{A3A6CD5C-4144-4752-9A13-B0E40D5078C8}">
   <ds:schemaRefs>
-    <ds:schemaRef ds:uri="http://schemas.microsoft.com/sharepoint/v3/contenttype/forms"/>
+    <ds:schemaRef ds:uri="http://schemas.openxmlformats.org/officeDocument/2006/bibliography"/>
   </ds:schemaRefs>
 </ds:datastoreItem>
 </file>
 
-<file path=customXml/itemProps3.xml><?xml version="1.0" encoding="utf-8"?>
+<file path=customXml/itemProps4.xml><?xml version="1.0" encoding="utf-8"?>
 <ds:datastoreItem xmlns:ds="http://schemas.openxmlformats.org/officeDocument/2006/customXml" ds:itemID="{207FFD94-A1EC-4865-B975-C78E2987FD9B}">
   <ds:schemaRefs>
     <ds:schemaRef ds:uri="http://schemas.microsoft.com/office/2006/metadata/contentType"/>
@@ -3057,12 +3058,4 @@
     <ds:schemaRef ds:uri="http://schemas.microsoft.com/internal/obd"/>
   </ds:schemaRefs>
 </ds:datastoreItem>
-</file>
-
-<file path=customXml/itemProps4.xml><?xml version="1.0" encoding="utf-8"?>
-<ds:datastoreItem xmlns:ds="http://schemas.openxmlformats.org/officeDocument/2006/customXml" ds:itemID="{A3A6CD5C-4144-4752-9A13-B0E40D5078C8}">
-  <ds:schemaRefs>
-    <ds:schemaRef ds:uri="http://schemas.openxmlformats.org/officeDocument/2006/bibliography"/>
-  </ds:schemaRefs>
-</ds:datastoreItem>
 </file>
</xml_diff>